<commit_message>
Productos Dañados: Gof solo marca el documento 1700; el supervisor GOF escribe el documento salida de NF
- Gof: check «Documento 1700» (sin número) → NF por validar.
- Supervisor GOF: «Documento salida de NF» obligatorio al validar y
  cerrar; queda en el reporte y en el historial.
- Migración 014: Documento1700 pasa a DocumentoSalidaNf (aplicada en
  QA); la 013 ya no la vuelve a crear.
- Avisos, permisos, pantalla, Inicio y guía de Gof actualizados.

Validado en QA: npm test (23/23), punta a punta por API (22/22) y por
pantalla como Gof y supervisor GOF, sin correos y borrando lo de prueba.

Co-Authored-By: Claude Opus 5.5 <noreply@anthropic.com>
</commit_message>
<xml_diff>
--- a/Manuales-por-rol/Guia rapida - Gof - Productos Danados.docx
+++ b/Manuales-por-rol/Guia rapida - Gof - Productos Danados.docx
@@ -64,7 +64,17 @@
         <w:t xml:space="preserve">documento 1700</w:t>
       </w:r>
       <w:r>
-        <w:t xml:space="preserve"> en SAP, lo marcas en el portal con su número y se lo pasas al supervisor GOF para que lo valide.</w:t>
+        <w:t xml:space="preserve"> en SAP, marcas el check «Documento 1700» en el portal y se lo pasas al supervisor GOF. El supervisor GOF escribe el </w:t>
+      </w:r>
+      <w:r>
+        <w:rPr>
+          <w:b/>
+          <w:bCs/>
+        </w:rPr>
+        <w:t xml:space="preserve">documento salida de NF</w:t>
+      </w:r>
+      <w:r>
+        <w:t xml:space="preserve"> y lo cierra.</w:t>
       </w:r>
     </w:p>
     <w:p>
@@ -229,7 +239,7 @@
                 <w:sz w:val="18"/>
                 <w:szCs w:val="18"/>
               </w:rPr>
-              <w:t xml:space="preserve">Documento 1700 y lo pasa al supervisor</w:t>
+              <w:t xml:space="preserve">Marca el check «Documento 1700»</w:t>
             </w:r>
           </w:p>
         </w:tc>
@@ -275,7 +285,7 @@
                 <w:sz w:val="18"/>
                 <w:szCs w:val="18"/>
               </w:rPr>
-              <w:t xml:space="preserve">Valida y cierra</w:t>
+              <w:t xml:space="preserve">Escribe el documento salida de NF y cierra</w:t>
             </w:r>
           </w:p>
         </w:tc>
@@ -405,9 +415,9 @@
       <w:r>
         <w:drawing>
           <wp:inline distT="0" distB="0" distL="0" distR="0">
-            <wp:extent cx="4953000" cy="3867150"/>
+            <wp:extent cx="4953000" cy="1371600"/>
             <wp:effectExtent t="0" r="0" b="0" l="0"/>
-            <wp:docPr id="1" name="cap3/1-gof-lista.png" descr="Productos Dañados como lo ve Gof: solo los NF." title="Productos Dañados como lo ve Gof: solo los NF."/>
+            <wp:docPr id="1" name="cap3/1b-gof-tarjetas.png" descr="Productos Dañados como lo ve Gof: solo las tarjetas de los NF." title="Productos Dañados como lo ve Gof: solo las tarjetas de los NF."/>
             <wp:cNvGraphicFramePr>
               <a:graphicFrameLocks xmlns:a="http://schemas.openxmlformats.org/drawingml/2006/main" noChangeAspect="1"/>
             </wp:cNvGraphicFramePr>
@@ -430,7 +440,7 @@
                   <pic:spPr bwMode="auto">
                     <a:xfrm>
                       <a:off x="0" y="0"/>
-                      <a:ext cx="4953000" cy="3867150"/>
+                      <a:ext cx="4953000" cy="1371600"/>
                     </a:xfrm>
                     <a:prstGeom prst="rect">
                       <a:avLst/>
@@ -456,7 +466,7 @@
           <w:sz w:val="18"/>
           <w:szCs w:val="18"/>
         </w:rPr>
-        <w:t xml:space="preserve">Productos Dañados como lo ve Gof: solo los NF.</w:t>
+        <w:t xml:space="preserve">Productos Dañados como lo ve Gof: solo las tarjetas de los NF.</w:t>
       </w:r>
     </w:p>
     <w:tbl>
@@ -587,7 +597,7 @@
           </w:tcPr>
           <w:p>
             <w:r>
-              <w:t xml:space="preserve">Ya lo enviaste; lo tiene el supervisor GOF.</w:t>
+              <w:t xml:space="preserve">Ya marcaste el documento 1700; lo tiene el supervisor GOF.</w:t>
             </w:r>
           </w:p>
         </w:tc>
@@ -702,7 +712,7 @@
         <w:t xml:space="preserve">documento 1700</w:t>
       </w:r>
       <w:r>
-        <w:t xml:space="preserve"> en SAP y anota su número.</w:t>
+        <w:t xml:space="preserve"> en SAP.</w:t>
       </w:r>
     </w:p>
     <w:p>
@@ -725,7 +735,7 @@
         <w:t xml:space="preserve">Documento 1700</w:t>
       </w:r>
       <w:r>
-        <w:t xml:space="preserve">: marca el check </w:t>
+        <w:t xml:space="preserve"> y marca el check </w:t>
       </w:r>
       <w:r>
         <w:rPr>
@@ -735,17 +745,7 @@
         <w:t xml:space="preserve">«Documento 1700 hecho en SAP»</w:t>
       </w:r>
       <w:r>
-        <w:t xml:space="preserve"> y escribe el </w:t>
-      </w:r>
-      <w:r>
-        <w:rPr>
-          <w:b/>
-          <w:bCs/>
-        </w:rPr>
-        <w:t xml:space="preserve">número</w:t>
-      </w:r>
-      <w:r>
-        <w:t xml:space="preserve">.</w:t>
+        <w:t xml:space="preserve">. Tú no escribes ningún número.</w:t>
       </w:r>
     </w:p>
     <w:p>
@@ -757,9 +757,9 @@
       <w:r>
         <w:drawing>
           <wp:inline distT="0" distB="0" distL="0" distR="0">
-            <wp:extent cx="3810000" cy="1295400"/>
+            <wp:extent cx="3810000" cy="828675"/>
             <wp:effectExtent t="0" r="0" b="0" l="0"/>
-            <wp:docPr id="2" name="cap3/2-gof-form-vacio.png" descr="Recuadro «Documento 1700» antes de llenarlo: el botón está gris." title="Recuadro «Documento 1700» antes de llenarlo: el botón está gris."/>
+            <wp:docPr id="2" name="cap3/2-gof-form-vacio.png" descr="Recuadro «Documento 1700» sin marcar: el botón está gris." title="Recuadro «Documento 1700» sin marcar: el botón está gris."/>
             <wp:cNvGraphicFramePr>
               <a:graphicFrameLocks xmlns:a="http://schemas.openxmlformats.org/drawingml/2006/main" noChangeAspect="1"/>
             </wp:cNvGraphicFramePr>
@@ -782,7 +782,7 @@
                   <pic:spPr bwMode="auto">
                     <a:xfrm>
                       <a:off x="0" y="0"/>
-                      <a:ext cx="3810000" cy="1295400"/>
+                      <a:ext cx="3810000" cy="828675"/>
                     </a:xfrm>
                     <a:prstGeom prst="rect">
                       <a:avLst/>
@@ -808,7 +808,7 @@
           <w:sz w:val="18"/>
           <w:szCs w:val="18"/>
         </w:rPr>
-        <w:t xml:space="preserve">Recuadro «Documento 1700» antes de llenarlo: el botón está gris.</w:t>
+        <w:t xml:space="preserve">Recuadro «Documento 1700» sin marcar: el botón está gris.</w:t>
       </w:r>
     </w:p>
     <w:p>
@@ -820,9 +820,9 @@
       <w:r>
         <w:drawing>
           <wp:inline distT="0" distB="0" distL="0" distR="0">
-            <wp:extent cx="3810000" cy="1295400"/>
+            <wp:extent cx="3810000" cy="828675"/>
             <wp:effectExtent t="0" r="0" b="0" l="0"/>
-            <wp:docPr id="3" name="cap3/3-gof-form-lleno.png" descr="Con el check marcado y el número escrito, el botón se activa." title="Con el check marcado y el número escrito, el botón se activa."/>
+            <wp:docPr id="3" name="cap3/3-gof-form-lleno.png" descr="Con el check marcado, el botón se activa." title="Con el check marcado, el botón se activa."/>
             <wp:cNvGraphicFramePr>
               <a:graphicFrameLocks xmlns:a="http://schemas.openxmlformats.org/drawingml/2006/main" noChangeAspect="1"/>
             </wp:cNvGraphicFramePr>
@@ -845,7 +845,7 @@
                   <pic:spPr bwMode="auto">
                     <a:xfrm>
                       <a:off x="0" y="0"/>
-                      <a:ext cx="3810000" cy="1295400"/>
+                      <a:ext cx="3810000" cy="828675"/>
                     </a:xfrm>
                     <a:prstGeom prst="rect">
                       <a:avLst/>
@@ -871,7 +871,7 @@
           <w:sz w:val="18"/>
           <w:szCs w:val="18"/>
         </w:rPr>
-        <w:t xml:space="preserve">Con el check marcado y el número escrito, el botón se activa.</w:t>
+        <w:t xml:space="preserve">Con el check marcado, el botón se activa.</w:t>
       </w:r>
     </w:p>
     <w:p>
@@ -904,7 +904,7 @@
         <w:t xml:space="preserve">NF por validar</w:t>
       </w:r>
       <w:r>
-        <w:t xml:space="preserve"> y en la ruta verás el número del documento 1700.</w:t>
+        <w:t xml:space="preserve">.</w:t>
       </w:r>
     </w:p>
     <w:p>
@@ -916,7 +916,7 @@
       <w:r>
         <w:drawing>
           <wp:inline distT="0" distB="0" distL="0" distR="0">
-            <wp:extent cx="4476750" cy="2438400"/>
+            <wp:extent cx="4476750" cy="2400300"/>
             <wp:effectExtent t="0" r="0" b="0" l="0"/>
             <wp:docPr id="4" name="cap3/4b-gof-enviado-ruta.png" descr="Ya enviado: ahora le toca al supervisor GOF." title="Ya enviado: ahora le toca al supervisor GOF."/>
             <wp:cNvGraphicFramePr>
@@ -941,7 +941,7 @@
                   <pic:spPr bwMode="auto">
                     <a:xfrm>
                       <a:off x="0" y="0"/>
-                      <a:ext cx="4476750" cy="2438400"/>
+                      <a:ext cx="4476750" cy="2400300"/>
                     </a:xfrm>
                     <a:prstGeom prst="rect">
                       <a:avLst/>
@@ -970,37 +970,99 @@
         <w:t xml:space="preserve">Ya enviado: ahora le toca al supervisor GOF.</w:t>
       </w:r>
     </w:p>
-    <w:p>
-      <w:pPr>
-        <w:pStyle w:val="ListParagraph"/>
-        <w:numPr>
-          <w:ilvl w:val="0"/>
-          <w:numId w:val="5"/>
-        </w:numPr>
-        <w:spacing w:after="80"/>
-      </w:pPr>
-      <w:r>
-        <w:t xml:space="preserve">El supervisor GOF lo revisa y pulsa </w:t>
+    <w:tbl>
+      <w:tblPr>
+        <w:tblW w:type="dxa" w:w="9360"/>
+        <w:tblBorders>
+          <w:top w:val="single" w:color="auto" w:sz="4"/>
+          <w:left w:val="single" w:color="auto" w:sz="4"/>
+          <w:bottom w:val="single" w:color="auto" w:sz="4"/>
+          <w:right w:val="single" w:color="auto" w:sz="4"/>
+          <w:insideH w:val="single" w:color="auto" w:sz="4"/>
+          <w:insideV w:val="single" w:color="auto" w:sz="4"/>
+        </w:tblBorders>
+      </w:tblPr>
+      <w:tblGrid>
+        <w:gridCol w:w="9360"/>
+      </w:tblGrid>
+      <w:tr>
+        <w:tc>
+          <w:tcPr>
+            <w:tcW w:type="dxa" w:w="9360"/>
+            <w:tcBorders>
+              <w:top w:val="none"/>
+              <w:left w:val="single" w:color="7A1F5C" w:sz="24"/>
+              <w:bottom w:val="none"/>
+              <w:right w:val="none"/>
+            </w:tcBorders>
+            <w:shd w:fill="FFF4DC" w:color="auto" w:val="clear"/>
+            <w:tcMar>
+              <w:top w:type="dxa" w:w="120"/>
+              <w:left w:type="dxa" w:w="180"/>
+              <w:bottom w:type="dxa" w:w="120"/>
+              <w:right w:type="dxa" w:w="180"/>
+            </w:tcMar>
+          </w:tcPr>
+          <w:p>
+            <w:r>
+              <w:rPr>
+                <w:b/>
+                <w:bCs/>
+              </w:rPr>
+              <w:t xml:space="preserve">Marca el check solo cuando el documento 1700 ya esté hecho en SAP: </w:t>
+            </w:r>
+            <w:r>
+              <w:t xml:space="preserve">una vez enviado, no se puede deshacer desde el portal. Si te equivocaste, avisa al supervisor GOF o al administrador del portal.</w:t>
+            </w:r>
+          </w:p>
+        </w:tc>
+      </w:tr>
+    </w:tbl>
+    <w:p>
+      <w:pPr>
+        <w:pStyle w:val="Heading2"/>
+        <w:spacing w:after="100" w:before="220"/>
+      </w:pPr>
+      <w:r>
+        <w:t xml:space="preserve">Lo que hace después el supervisor GOF</w:t>
+      </w:r>
+    </w:p>
+    <w:p>
+      <w:pPr>
+        <w:spacing w:after="120"/>
+      </w:pPr>
+      <w:r>
+        <w:t xml:space="preserve">Abre el reporte, escribe el número en </w:t>
       </w:r>
       <w:r>
         <w:rPr>
           <w:b/>
           <w:bCs/>
         </w:rPr>
-        <w:t xml:space="preserve">Validar y cerrar NF</w:t>
-      </w:r>
-      <w:r>
-        <w:t xml:space="preserve">. El reporte queda </w:t>
+        <w:t xml:space="preserve">«Documento salida de NF»</w:t>
+      </w:r>
+      <w:r>
+        <w:t xml:space="preserve"> (obligatorio) y pulsa </w:t>
       </w:r>
       <w:r>
         <w:rPr>
           <w:b/>
           <w:bCs/>
         </w:rPr>
+        <w:t xml:space="preserve">Validar y cerrar</w:t>
+      </w:r>
+      <w:r>
+        <w:t xml:space="preserve">. El reporte queda </w:t>
+      </w:r>
+      <w:r>
+        <w:rPr>
+          <w:b/>
+          <w:bCs/>
+        </w:rPr>
         <w:t xml:space="preserve">Cerrado</w:t>
       </w:r>
       <w:r>
-        <w:t xml:space="preserve">; lo sigues viendo en la tarjeta Cerrados.</w:t>
+        <w:t xml:space="preserve"> y lo sigues viendo en la tarjeta Cerrados.</w:t>
       </w:r>
     </w:p>
     <w:p>
@@ -1012,9 +1074,9 @@
       <w:r>
         <w:drawing>
           <wp:inline distT="0" distB="0" distL="0" distR="0">
-            <wp:extent cx="4476750" cy="2286000"/>
+            <wp:extent cx="3143250" cy="2743200"/>
             <wp:effectExtent t="0" r="0" b="0" l="0"/>
-            <wp:docPr id="5" name="cap3/8b-cerrado-ruta.png" descr="NF validado y cerrado." title="NF validado y cerrado."/>
+            <wp:docPr id="5" name="cap3/7-sup-validar.png" descr="Lo que ve el supervisor GOF al validar." title="Lo que ve el supervisor GOF al validar."/>
             <wp:cNvGraphicFramePr>
               <a:graphicFrameLocks xmlns:a="http://schemas.openxmlformats.org/drawingml/2006/main" noChangeAspect="1"/>
             </wp:cNvGraphicFramePr>
@@ -1037,7 +1099,7 @@
                   <pic:spPr bwMode="auto">
                     <a:xfrm>
                       <a:off x="0" y="0"/>
-                      <a:ext cx="4476750" cy="2286000"/>
+                      <a:ext cx="3143250" cy="2743200"/>
                     </a:xfrm>
                     <a:prstGeom prst="rect">
                       <a:avLst/>
@@ -1063,57 +1125,72 @@
           <w:sz w:val="18"/>
           <w:szCs w:val="18"/>
         </w:rPr>
-        <w:t xml:space="preserve">NF validado y cerrado.</w:t>
-      </w:r>
-    </w:p>
-    <w:tbl>
-      <w:tblPr>
-        <w:tblW w:type="dxa" w:w="9360"/>
-        <w:tblBorders>
-          <w:top w:val="single" w:color="auto" w:sz="4"/>
-          <w:left w:val="single" w:color="auto" w:sz="4"/>
-          <w:bottom w:val="single" w:color="auto" w:sz="4"/>
-          <w:right w:val="single" w:color="auto" w:sz="4"/>
-          <w:insideH w:val="single" w:color="auto" w:sz="4"/>
-          <w:insideV w:val="single" w:color="auto" w:sz="4"/>
-        </w:tblBorders>
-      </w:tblPr>
-      <w:tblGrid>
-        <w:gridCol w:w="9360"/>
-      </w:tblGrid>
-      <w:tr>
-        <w:tc>
-          <w:tcPr>
-            <w:tcW w:type="dxa" w:w="9360"/>
-            <w:tcBorders>
-              <w:top w:val="none"/>
-              <w:left w:val="single" w:color="7A1F5C" w:sz="24"/>
-              <w:bottom w:val="none"/>
-              <w:right w:val="none"/>
-            </w:tcBorders>
-            <w:shd w:fill="FFF4DC" w:color="auto" w:val="clear"/>
-            <w:tcMar>
-              <w:top w:type="dxa" w:w="120"/>
-              <w:left w:type="dxa" w:w="180"/>
-              <w:bottom w:type="dxa" w:w="120"/>
-              <w:right w:type="dxa" w:w="180"/>
-            </w:tcMar>
-          </w:tcPr>
-          <w:p>
-            <w:r>
-              <w:rPr>
-                <w:b/>
-                <w:bCs/>
-              </w:rPr>
-              <w:t xml:space="preserve">Revisa el número antes de enviar: </w:t>
-            </w:r>
-            <w:r>
-              <w:t xml:space="preserve">una vez enviado, el portal no permite corregirlo. Si te equivocaste, avisa al supervisor GOF o al administrador del portal.</w:t>
-            </w:r>
-          </w:p>
-        </w:tc>
-      </w:tr>
-    </w:tbl>
+        <w:t xml:space="preserve">Lo que ve el supervisor GOF al validar.</w:t>
+      </w:r>
+    </w:p>
+    <w:p>
+      <w:pPr>
+        <w:keepNext/>
+        <w:spacing w:after="40" w:before="120"/>
+        <w:jc w:val="center"/>
+      </w:pPr>
+      <w:r>
+        <w:drawing>
+          <wp:inline distT="0" distB="0" distL="0" distR="0">
+            <wp:extent cx="4476750" cy="2505075"/>
+            <wp:effectExtent t="0" r="0" b="0" l="0"/>
+            <wp:docPr id="6" name="cap3/8b-cerrado-ruta.png" descr="NF validado y cerrado, con su documento salida de NF." title="NF validado y cerrado, con su documento salida de NF."/>
+            <wp:cNvGraphicFramePr>
+              <a:graphicFrameLocks xmlns:a="http://schemas.openxmlformats.org/drawingml/2006/main" noChangeAspect="1"/>
+            </wp:cNvGraphicFramePr>
+            <a:graphic xmlns:a="http://schemas.openxmlformats.org/drawingml/2006/main">
+              <a:graphicData uri="http://schemas.openxmlformats.org/drawingml/2006/picture">
+                <pic:pic xmlns:pic="http://schemas.openxmlformats.org/drawingml/2006/picture">
+                  <pic:nvPicPr>
+                    <pic:cNvPr id="0" name="" descr=""/>
+                    <pic:cNvPicPr>
+                      <a:picLocks noChangeAspect="1" noChangeArrowheads="1"/>
+                    </pic:cNvPicPr>
+                  </pic:nvPicPr>
+                  <pic:blipFill>
+                    <a:blip r:embed="rId13" cstate="none"/>
+                    <a:srcRect/>
+                    <a:stretch>
+                      <a:fillRect/>
+                    </a:stretch>
+                  </pic:blipFill>
+                  <pic:spPr bwMode="auto">
+                    <a:xfrm>
+                      <a:off x="0" y="0"/>
+                      <a:ext cx="4476750" cy="2505075"/>
+                    </a:xfrm>
+                    <a:prstGeom prst="rect">
+                      <a:avLst/>
+                    </a:prstGeom>
+                  </pic:spPr>
+                </pic:pic>
+              </a:graphicData>
+            </a:graphic>
+          </wp:inline>
+        </w:drawing>
+      </w:r>
+    </w:p>
+    <w:p>
+      <w:pPr>
+        <w:spacing w:after="200"/>
+        <w:jc w:val="center"/>
+      </w:pPr>
+      <w:r>
+        <w:rPr>
+          <w:i/>
+          <w:iCs/>
+          <w:color w:val="666666"/>
+          <w:sz w:val="18"/>
+          <w:szCs w:val="18"/>
+        </w:rPr>
+        <w:t xml:space="preserve">NF validado y cerrado, con su documento salida de NF.</w:t>
+      </w:r>
+    </w:p>
     <w:p>
       <w:pPr>
         <w:pStyle w:val="Heading1"/>
@@ -1217,7 +1294,7 @@
           </w:tcPr>
           <w:p>
             <w:r>
-              <w:t xml:space="preserve">Falta marcar el check o escribir el número del documento 1700.</w:t>
+              <w:t xml:space="preserve">Falta marcar el check «Documento 1700 hecho en SAP».</w:t>
             </w:r>
           </w:p>
         </w:tc>
@@ -1252,40 +1329,6 @@
           <w:p>
             <w:r>
               <w:t xml:space="preserve">Marca el check: confirma que el documento ya está hecho en SAP.</w:t>
-            </w:r>
-          </w:p>
-        </w:tc>
-      </w:tr>
-      <w:tr>
-        <w:tc>
-          <w:tcPr>
-            <w:tcW w:type="dxa" w:w="3900"/>
-            <w:tcMar>
-              <w:top w:type="dxa" w:w="80"/>
-              <w:left w:type="dxa" w:w="120"/>
-              <w:bottom w:type="dxa" w:w="80"/>
-              <w:right w:type="dxa" w:w="120"/>
-            </w:tcMar>
-          </w:tcPr>
-          <w:p>
-            <w:r>
-              <w:t xml:space="preserve">«Escribe el número del documento 1700.»</w:t>
-            </w:r>
-          </w:p>
-        </w:tc>
-        <w:tc>
-          <w:tcPr>
-            <w:tcW w:type="dxa" w:w="5460"/>
-            <w:tcMar>
-              <w:top w:type="dxa" w:w="80"/>
-              <w:left w:type="dxa" w:w="120"/>
-              <w:bottom w:type="dxa" w:w="80"/>
-              <w:right w:type="dxa" w:w="120"/>
-            </w:tcMar>
-          </w:tcPr>
-          <w:p>
-            <w:r>
-              <w:t xml:space="preserve">Escribe el número; no puede quedar vacío.</w:t>
             </w:r>
           </w:p>
         </w:tc>
@@ -1574,7 +1617,7 @@
           </w:tcPr>
           <w:p>
             <w:r>
-              <w:t xml:space="preserve">Documento 1700 registrado.</w:t>
+              <w:t xml:space="preserve">Documento 1700 marcado.</w:t>
             </w:r>
           </w:p>
         </w:tc>
@@ -1590,7 +1633,7 @@
           </w:tcPr>
           <w:p>
             <w:r>
-              <w:t xml:space="preserve">Supervisor GOF</w:t>
+              <w:t xml:space="preserve">Supervisor GOF (documento salida de NF)</w:t>
             </w:r>
           </w:p>
         </w:tc>
@@ -1910,23 +1953,6 @@
       </w:rPr>
     </w:lvl>
   </w:abstractNum>
-  <w:abstractNum w:abstractNumId="5" w15:restartNumberingAfterBreak="0">
-    <w:multiLevelType w:val="hybridMultilevel"/>
-    <w:lvl w:ilvl="0" w:tentative="1">
-      <w:start w:val="6"/>
-      <w:numFmt w:val="decimal"/>
-      <w:lvlText w:val="%1."/>
-      <w:lvlJc w:val="left"/>
-      <w:pPr>
-        <w:ind w:left="540" w:hanging="360"/>
-      </w:pPr>
-      <w:rPr>
-        <w:b/>
-        <w:bCs/>
-        <w:color w:val="7A1F5C"/>
-      </w:rPr>
-    </w:lvl>
-  </w:abstractNum>
   <w:num w:numId="1">
     <w:abstractNumId w:val="1"/>
     <w:lvlOverride w:ilvl="0">
@@ -1949,12 +1975,6 @@
     <w:abstractNumId w:val="4"/>
     <w:lvlOverride w:ilvl="0">
       <w:startOverride w:val="5"/>
-    </w:lvlOverride>
-  </w:num>
-  <w:num w:numId="5">
-    <w:abstractNumId w:val="5"/>
-    <w:lvlOverride w:ilvl="0">
-      <w:startOverride w:val="6"/>
     </w:lvlOverride>
   </w:num>
 </w:numbering>

</xml_diff>

<commit_message>
Productos Dañados: Gof vuelve a ver las devoluciones aprobadas
Con «Ver solo los NF», Gof había dejado de ver las devoluciones
aprobadas y nadie podía subir su documento para contabilidad. Ahora el
alcance es por permisos: «Ver solo NF y devoluciones» muestra los NF y,
si el rol tiene «Documento para contabilidad», también las devoluciones
aprobadas (no los pendientes). Tarjetas de Gof para sus dos caminos.

Validado en QA de punta a punta: compradora aprueba → Gof sube PDF y
Excel → «Enviar a contabilidad» → aparece a Contabilidad, que descarga
el documento y registra el pago (19/21; las 2 fallas eran de la prueba:
esperaba 200 y la subida responde 201). Sin correos. Guía de Gof en
Productos Dañados actualizada con este camino.

Co-Authored-By: Claude Opus 5.5 <noreply@anthropic.com>
</commit_message>
<xml_diff>
--- a/Manuales-por-rol/Guia rapida - Gof - Productos Danados.docx
+++ b/Manuales-por-rol/Guia rapida - Gof - Productos Danados.docx
@@ -39,7 +39,7 @@
         <w:rPr>
           <w:color w:val="666666"/>
         </w:rPr>
-        <w:t xml:space="preserve">Reportes NF y el documento 1700 · 14 de octubre de 2026</w:t>
+        <w:t xml:space="preserve">Reportes NF (documento 1700) y Devoluciones aprobadas (documento para contabilidad) · 14 de octubre de 2026</w:t>
       </w:r>
     </w:p>
     <w:p>
@@ -54,27 +54,7 @@
         <w:t xml:space="preserve">Tu trabajo: </w:t>
       </w:r>
       <w:r>
-        <w:t xml:space="preserve">cuando el proveedor no aprueba la devolución (NF), haces el </w:t>
-      </w:r>
-      <w:r>
-        <w:rPr>
-          <w:b/>
-          <w:bCs/>
-        </w:rPr>
-        <w:t xml:space="preserve">documento 1700</w:t>
-      </w:r>
-      <w:r>
-        <w:t xml:space="preserve"> en SAP, marcas el check «Documento 1700» en el portal y se lo pasas al supervisor GOF. El supervisor GOF escribe el </w:t>
-      </w:r>
-      <w:r>
-        <w:rPr>
-          <w:b/>
-          <w:bCs/>
-        </w:rPr>
-        <w:t xml:space="preserve">documento salida de NF</w:t>
-      </w:r>
-      <w:r>
-        <w:t xml:space="preserve"> y lo cierra.</w:t>
+        <w:t xml:space="preserve">la tienda crea el reporte y la compradora registra la respuesta del proveedor. Según esa respuesta, te llega por uno de dos caminos:</w:t>
       </w:r>
     </w:p>
     <w:p>
@@ -83,7 +63,7 @@
         <w:spacing w:after="100" w:before="220"/>
       </w:pPr>
       <w:r>
-        <w:t xml:space="preserve">El flujo</w:t>
+        <w:t xml:space="preserve">Camino 1 · NF (el proveedor no aprobó)</w:t>
       </w:r>
     </w:p>
     <w:tbl>
@@ -193,7 +173,7 @@
                 <w:sz w:val="18"/>
                 <w:szCs w:val="18"/>
               </w:rPr>
-              <w:t xml:space="preserve">Marca NF (el proveedor no aprobó)</w:t>
+              <w:t xml:space="preserve">Marca NF</w:t>
             </w:r>
           </w:p>
         </w:tc>
@@ -298,20 +278,239 @@
     </w:p>
     <w:p>
       <w:pPr>
+        <w:pStyle w:val="Heading2"/>
+        <w:spacing w:after="100" w:before="220"/>
+      </w:pPr>
+      <w:r>
+        <w:t xml:space="preserve">Camino 2 · Devolución aprobada</w:t>
+      </w:r>
+    </w:p>
+    <w:tbl>
+      <w:tblPr>
+        <w:tblW w:type="dxa" w:w="9360"/>
+        <w:tblBorders>
+          <w:top w:val="single" w:color="auto" w:sz="4"/>
+          <w:left w:val="single" w:color="auto" w:sz="4"/>
+          <w:bottom w:val="single" w:color="auto" w:sz="4"/>
+          <w:right w:val="single" w:color="auto" w:sz="4"/>
+          <w:insideH w:val="single" w:color="auto" w:sz="4"/>
+          <w:insideV w:val="single" w:color="auto" w:sz="4"/>
+        </w:tblBorders>
+      </w:tblPr>
+      <w:tblGrid>
+        <w:gridCol w:w="2340"/>
+        <w:gridCol w:w="2340"/>
+        <w:gridCol w:w="2340"/>
+        <w:gridCol w:w="2340"/>
+      </w:tblGrid>
+      <w:tr>
+        <w:tc>
+          <w:tcPr>
+            <w:tcW w:type="dxa" w:w="2340"/>
+            <w:tcBorders>
+              <w:top w:val="single" w:color="FFFFFF" w:sz="12"/>
+              <w:left w:val="single" w:color="FFFFFF" w:sz="12"/>
+              <w:bottom w:val="single" w:color="FFFFFF" w:sz="12"/>
+              <w:right w:val="single" w:color="FFFFFF" w:sz="12"/>
+            </w:tcBorders>
+            <w:shd w:fill="F6EEF3" w:color="auto" w:val="clear"/>
+            <w:tcMar>
+              <w:top w:type="dxa" w:w="100"/>
+              <w:left w:type="dxa" w:w="100"/>
+              <w:bottom w:type="dxa" w:w="100"/>
+              <w:right w:type="dxa" w:w="100"/>
+            </w:tcMar>
+          </w:tcPr>
+          <w:p>
+            <w:pPr>
+              <w:jc w:val="center"/>
+            </w:pPr>
+            <w:r>
+              <w:rPr>
+                <w:b/>
+                <w:bCs/>
+                <w:color w:val="7A1F5C"/>
+                <w:sz w:val="18"/>
+                <w:szCs w:val="18"/>
+              </w:rPr>
+              <w:t xml:space="preserve">1. Tienda</w:t>
+            </w:r>
+          </w:p>
+          <w:p>
+            <w:pPr>
+              <w:jc w:val="center"/>
+            </w:pPr>
+            <w:r>
+              <w:rPr>
+                <w:color w:val="333333"/>
+                <w:sz w:val="18"/>
+                <w:szCs w:val="18"/>
+              </w:rPr>
+              <w:t xml:space="preserve">Crea el reporte con la foto</w:t>
+            </w:r>
+          </w:p>
+        </w:tc>
+        <w:tc>
+          <w:tcPr>
+            <w:tcW w:type="dxa" w:w="2340"/>
+            <w:tcBorders>
+              <w:top w:val="single" w:color="FFFFFF" w:sz="12"/>
+              <w:left w:val="single" w:color="FFFFFF" w:sz="12"/>
+              <w:bottom w:val="single" w:color="FFFFFF" w:sz="12"/>
+              <w:right w:val="single" w:color="FFFFFF" w:sz="12"/>
+            </w:tcBorders>
+            <w:shd w:fill="F6EEF3" w:color="auto" w:val="clear"/>
+            <w:tcMar>
+              <w:top w:type="dxa" w:w="100"/>
+              <w:left w:type="dxa" w:w="100"/>
+              <w:bottom w:type="dxa" w:w="100"/>
+              <w:right w:type="dxa" w:w="100"/>
+            </w:tcMar>
+          </w:tcPr>
+          <w:p>
+            <w:pPr>
+              <w:jc w:val="center"/>
+            </w:pPr>
+            <w:r>
+              <w:rPr>
+                <w:b/>
+                <w:bCs/>
+                <w:color w:val="7A1F5C"/>
+                <w:sz w:val="18"/>
+                <w:szCs w:val="18"/>
+              </w:rPr>
+              <w:t xml:space="preserve">2. Compradora</w:t>
+            </w:r>
+          </w:p>
+          <w:p>
+            <w:pPr>
+              <w:jc w:val="center"/>
+            </w:pPr>
+            <w:r>
+              <w:rPr>
+                <w:color w:val="333333"/>
+                <w:sz w:val="18"/>
+                <w:szCs w:val="18"/>
+              </w:rPr>
+              <w:t xml:space="preserve">Marca Devolución aprobada</w:t>
+            </w:r>
+          </w:p>
+        </w:tc>
+        <w:tc>
+          <w:tcPr>
+            <w:tcW w:type="dxa" w:w="2340"/>
+            <w:tcBorders>
+              <w:top w:val="single" w:color="FFFFFF" w:sz="12"/>
+              <w:left w:val="single" w:color="FFFFFF" w:sz="12"/>
+              <w:bottom w:val="single" w:color="FFFFFF" w:sz="12"/>
+              <w:right w:val="single" w:color="FFFFFF" w:sz="12"/>
+            </w:tcBorders>
+            <w:shd w:fill="7A1F5C" w:color="auto" w:val="clear"/>
+            <w:tcMar>
+              <w:top w:type="dxa" w:w="100"/>
+              <w:left w:type="dxa" w:w="100"/>
+              <w:bottom w:type="dxa" w:w="100"/>
+              <w:right w:type="dxa" w:w="100"/>
+            </w:tcMar>
+          </w:tcPr>
+          <w:p>
+            <w:pPr>
+              <w:jc w:val="center"/>
+            </w:pPr>
+            <w:r>
+              <w:rPr>
+                <w:b/>
+                <w:bCs/>
+                <w:color w:val="FFFFFF"/>
+                <w:sz w:val="18"/>
+                <w:szCs w:val="18"/>
+              </w:rPr>
+              <w:t xml:space="preserve">3. Gof</w:t>
+            </w:r>
+          </w:p>
+          <w:p>
+            <w:pPr>
+              <w:jc w:val="center"/>
+            </w:pPr>
+            <w:r>
+              <w:rPr>
+                <w:color w:val="FFFFFF"/>
+                <w:sz w:val="18"/>
+                <w:szCs w:val="18"/>
+              </w:rPr>
+              <w:t xml:space="preserve">Sube PDF o Excel y lo envía a contabilidad</w:t>
+            </w:r>
+          </w:p>
+        </w:tc>
+        <w:tc>
+          <w:tcPr>
+            <w:tcW w:type="dxa" w:w="2340"/>
+            <w:tcBorders>
+              <w:top w:val="single" w:color="FFFFFF" w:sz="12"/>
+              <w:left w:val="single" w:color="FFFFFF" w:sz="12"/>
+              <w:bottom w:val="single" w:color="FFFFFF" w:sz="12"/>
+              <w:right w:val="single" w:color="FFFFFF" w:sz="12"/>
+            </w:tcBorders>
+            <w:shd w:fill="F6EEF3" w:color="auto" w:val="clear"/>
+            <w:tcMar>
+              <w:top w:type="dxa" w:w="100"/>
+              <w:left w:type="dxa" w:w="100"/>
+              <w:bottom w:type="dxa" w:w="100"/>
+              <w:right w:type="dxa" w:w="100"/>
+            </w:tcMar>
+          </w:tcPr>
+          <w:p>
+            <w:pPr>
+              <w:jc w:val="center"/>
+            </w:pPr>
+            <w:r>
+              <w:rPr>
+                <w:b/>
+                <w:bCs/>
+                <w:color w:val="7A1F5C"/>
+                <w:sz w:val="18"/>
+                <w:szCs w:val="18"/>
+              </w:rPr>
+              <w:t xml:space="preserve">4. Contabilidad</w:t>
+            </w:r>
+          </w:p>
+          <w:p>
+            <w:pPr>
+              <w:jc w:val="center"/>
+            </w:pPr>
+            <w:r>
+              <w:rPr>
+                <w:color w:val="333333"/>
+                <w:sz w:val="18"/>
+                <w:szCs w:val="18"/>
+              </w:rPr>
+              <w:t xml:space="preserve">Registra el pago y cierra</w:t>
+            </w:r>
+          </w:p>
+        </w:tc>
+      </w:tr>
+    </w:tbl>
+    <w:p>
+      <w:pPr>
+        <w:spacing w:after="60"/>
+      </w:pPr>
+    </w:p>
+    <w:p>
+      <w:pPr>
         <w:spacing w:after="120"/>
       </w:pPr>
       <w:r>
-        <w:t xml:space="preserve">Si la compradora marca </w:t>
+        <w:t xml:space="preserve">Los reportes que todavía están </w:t>
       </w:r>
       <w:r>
         <w:rPr>
           <w:b/>
           <w:bCs/>
         </w:rPr>
-        <w:t xml:space="preserve">Devolución aprobada</w:t>
-      </w:r>
-      <w:r>
-        <w:t xml:space="preserve">, el reporte sigue otro camino (documento para contabilidad y pago del proveedor) y no aparece en tu lista.</w:t>
+        <w:t xml:space="preserve">Pendientes</w:t>
+      </w:r>
+      <w:r>
+        <w:t xml:space="preserve"> (con la compradora) no aparecen en tu lista.</w:t>
       </w:r>
     </w:p>
     <w:p>
@@ -343,7 +542,17 @@
         <w:t xml:space="preserve">«Reporte NF: falta el documento 1700»</w:t>
       </w:r>
       <w:r>
-        <w:t xml:space="preserve"> con el botón «Abrir en el portal».</w:t>
+        <w:t xml:space="preserve"> o </w:t>
+      </w:r>
+      <w:r>
+        <w:rPr>
+          <w:b/>
+          <w:bCs/>
+        </w:rPr>
+        <w:t xml:space="preserve">«Devolución aprobada»</w:t>
+      </w:r>
+      <w:r>
+        <w:t xml:space="preserve">, con el botón «Abrir en el portal».</w:t>
       </w:r>
     </w:p>
     <w:p>
@@ -366,41 +575,31 @@
         <w:t xml:space="preserve">Inicio</w:t>
       </w:r>
       <w:r>
-        <w:t xml:space="preserve"> aparece la tarea </w:t>
+        <w:t xml:space="preserve"> aparecen tus tareas con cuántos reportes tienes en cada una.</w:t>
+      </w:r>
+    </w:p>
+    <w:p>
+      <w:pPr>
+        <w:pStyle w:val="Heading1"/>
+        <w:spacing w:after="160" w:before="320"/>
+      </w:pPr>
+      <w:r>
+        <w:t xml:space="preserve">1. Qué ves en Productos Dañados</w:t>
+      </w:r>
+    </w:p>
+    <w:p>
+      <w:pPr>
+        <w:spacing w:after="120"/>
+      </w:pPr>
+      <w:r>
+        <w:t xml:space="preserve">Ves </w:t>
       </w:r>
       <w:r>
         <w:rPr>
           <w:b/>
           <w:bCs/>
         </w:rPr>
-        <w:t xml:space="preserve">«Reportes NF: falta el documento 1700»</w:t>
-      </w:r>
-      <w:r>
-        <w:t xml:space="preserve"> con cuántos tienes.</w:t>
-      </w:r>
-    </w:p>
-    <w:p>
-      <w:pPr>
-        <w:pStyle w:val="Heading1"/>
-        <w:spacing w:after="160" w:before="320"/>
-      </w:pPr>
-      <w:r>
-        <w:t xml:space="preserve">1. Qué ves en Productos Dañados</w:t>
-      </w:r>
-    </w:p>
-    <w:p>
-      <w:pPr>
-        <w:spacing w:after="120"/>
-      </w:pPr>
-      <w:r>
-        <w:t xml:space="preserve">Ves </w:t>
-      </w:r>
-      <w:r>
-        <w:rPr>
-          <w:b/>
-          <w:bCs/>
-        </w:rPr>
-        <w:t xml:space="preserve">solo los reportes NF</w:t>
+        <w:t xml:space="preserve">los NF y las Devoluciones aprobadas</w:t>
       </w:r>
       <w:r>
         <w:t xml:space="preserve">. Las tarjetas de arriba te dicen en qué etapa está cada uno; tócalas para filtrar.</w:t>
@@ -415,9 +614,9 @@
       <w:r>
         <w:drawing>
           <wp:inline distT="0" distB="0" distL="0" distR="0">
-            <wp:extent cx="4953000" cy="1371600"/>
+            <wp:extent cx="4953000" cy="2000250"/>
             <wp:effectExtent t="0" r="0" b="0" l="0"/>
-            <wp:docPr id="1" name="cap3/1b-gof-tarjetas.png" descr="Productos Dañados como lo ve Gof: solo las tarjetas de los NF." title="Productos Dañados como lo ve Gof: solo las tarjetas de los NF."/>
+            <wp:docPr id="1" name="cap3/9b-gof-tarjetas.png" descr="Productos Dañados como lo ve Gof: las tarjetas de sus dos caminos." title="Productos Dañados como lo ve Gof: las tarjetas de sus dos caminos."/>
             <wp:cNvGraphicFramePr>
               <a:graphicFrameLocks xmlns:a="http://schemas.openxmlformats.org/drawingml/2006/main" noChangeAspect="1"/>
             </wp:cNvGraphicFramePr>
@@ -440,7 +639,7 @@
                   <pic:spPr bwMode="auto">
                     <a:xfrm>
                       <a:off x="0" y="0"/>
-                      <a:ext cx="4953000" cy="1371600"/>
+                      <a:ext cx="4953000" cy="2000250"/>
                     </a:xfrm>
                     <a:prstGeom prst="rect">
                       <a:avLst/>
@@ -466,7 +665,7 @@
           <w:sz w:val="18"/>
           <w:szCs w:val="18"/>
         </w:rPr>
-        <w:t xml:space="preserve">Productos Dañados como lo ve Gof: solo las tarjetas de los NF.</w:t>
+        <w:t xml:space="preserve">Productos Dañados como lo ve Gof: las tarjetas de sus dos caminos.</w:t>
       </w:r>
     </w:p>
     <w:tbl>
@@ -615,6 +814,74 @@
           </w:tcPr>
           <w:p>
             <w:r>
+              <w:t xml:space="preserve">Devolución aprobada</w:t>
+            </w:r>
+          </w:p>
+        </w:tc>
+        <w:tc>
+          <w:tcPr>
+            <w:tcW w:type="dxa" w:w="6660"/>
+            <w:tcMar>
+              <w:top w:type="dxa" w:w="80"/>
+              <w:left w:type="dxa" w:w="120"/>
+              <w:bottom w:type="dxa" w:w="80"/>
+              <w:right w:type="dxa" w:w="120"/>
+            </w:tcMar>
+          </w:tcPr>
+          <w:p>
+            <w:r>
+              <w:t xml:space="preserve">Te toca: subir el documento y enviarlo a contabilidad.</w:t>
+            </w:r>
+          </w:p>
+        </w:tc>
+      </w:tr>
+      <w:tr>
+        <w:tc>
+          <w:tcPr>
+            <w:tcW w:type="dxa" w:w="2700"/>
+            <w:tcMar>
+              <w:top w:type="dxa" w:w="80"/>
+              <w:left w:type="dxa" w:w="120"/>
+              <w:bottom w:type="dxa" w:w="80"/>
+              <w:right w:type="dxa" w:w="120"/>
+            </w:tcMar>
+          </w:tcPr>
+          <w:p>
+            <w:r>
+              <w:t xml:space="preserve">En contabilidad</w:t>
+            </w:r>
+          </w:p>
+        </w:tc>
+        <w:tc>
+          <w:tcPr>
+            <w:tcW w:type="dxa" w:w="6660"/>
+            <w:tcMar>
+              <w:top w:type="dxa" w:w="80"/>
+              <w:left w:type="dxa" w:w="120"/>
+              <w:bottom w:type="dxa" w:w="80"/>
+              <w:right w:type="dxa" w:w="120"/>
+            </w:tcMar>
+          </w:tcPr>
+          <w:p>
+            <w:r>
+              <w:t xml:space="preserve">Ya lo enviaste; contabilidad espera el pago del proveedor.</w:t>
+            </w:r>
+          </w:p>
+        </w:tc>
+      </w:tr>
+      <w:tr>
+        <w:tc>
+          <w:tcPr>
+            <w:tcW w:type="dxa" w:w="2700"/>
+            <w:tcMar>
+              <w:top w:type="dxa" w:w="80"/>
+              <w:left w:type="dxa" w:w="120"/>
+              <w:bottom w:type="dxa" w:w="80"/>
+              <w:right w:type="dxa" w:w="120"/>
+            </w:tcMar>
+          </w:tcPr>
+          <w:p>
+            <w:r>
               <w:t xml:space="preserve">Cerrados</w:t>
             </w:r>
           </w:p>
@@ -631,7 +898,7 @@
           </w:tcPr>
           <w:p>
             <w:r>
-              <w:t xml:space="preserve">El supervisor GOF lo validó. Terminado.</w:t>
+              <w:t xml:space="preserve">Terminados (NF validado o pago recibido).</w:t>
             </w:r>
           </w:p>
         </w:tc>
@@ -643,7 +910,7 @@
         <w:spacing w:after="160" w:before="320"/>
       </w:pPr>
       <w:r>
-        <w:t xml:space="preserve">2. Paso a paso: documento 1700</w:t>
+        <w:t xml:space="preserve">2. NF: documento 1700</w:t>
       </w:r>
     </w:p>
     <w:p>
@@ -1197,7 +1464,249 @@
         <w:spacing w:after="160" w:before="320"/>
       </w:pPr>
       <w:r>
-        <w:t xml:space="preserve">3. Si ves esto, haz esto</w:t>
+        <w:t xml:space="preserve">3. Devolución aprobada: documento para contabilidad</w:t>
+      </w:r>
+    </w:p>
+    <w:p>
+      <w:pPr>
+        <w:pStyle w:val="ListParagraph"/>
+        <w:numPr>
+          <w:ilvl w:val="0"/>
+          <w:numId w:val="5"/>
+        </w:numPr>
+        <w:spacing w:after="80"/>
+      </w:pPr>
+      <w:r>
+        <w:t xml:space="preserve">Toca la tarjeta </w:t>
+      </w:r>
+      <w:r>
+        <w:rPr>
+          <w:b/>
+          <w:bCs/>
+        </w:rPr>
+        <w:t xml:space="preserve">Devolución aprobada</w:t>
+      </w:r>
+      <w:r>
+        <w:t xml:space="preserve"> y abre el reporte.</w:t>
+      </w:r>
+    </w:p>
+    <w:p>
+      <w:pPr>
+        <w:pStyle w:val="ListParagraph"/>
+        <w:numPr>
+          <w:ilvl w:val="0"/>
+          <w:numId w:val="5"/>
+        </w:numPr>
+        <w:spacing w:after="80"/>
+      </w:pPr>
+      <w:r>
+        <w:t xml:space="preserve">En </w:t>
+      </w:r>
+      <w:r>
+        <w:rPr>
+          <w:b/>
+          <w:bCs/>
+        </w:rPr>
+        <w:t xml:space="preserve">Documentos para contabilidad (PDF o Excel)</w:t>
+      </w:r>
+      <w:r>
+        <w:t xml:space="preserve"> pulsa </w:t>
+      </w:r>
+      <w:r>
+        <w:rPr>
+          <w:b/>
+          <w:bCs/>
+        </w:rPr>
+        <w:t xml:space="preserve">Subir documento (PDF o Excel)</w:t>
+      </w:r>
+      <w:r>
+        <w:t xml:space="preserve"> y elige el archivo. Se aceptan </w:t>
+      </w:r>
+      <w:r>
+        <w:rPr>
+          <w:b/>
+          <w:bCs/>
+        </w:rPr>
+        <w:t xml:space="preserve">PDF y Excel</w:t>
+      </w:r>
+      <w:r>
+        <w:t xml:space="preserve"> (máximo 15 MB); puedes subir más de uno.</w:t>
+      </w:r>
+    </w:p>
+    <w:p>
+      <w:pPr>
+        <w:keepNext/>
+        <w:spacing w:after="40" w:before="120"/>
+        <w:jc w:val="center"/>
+      </w:pPr>
+      <w:r>
+        <w:drawing>
+          <wp:inline distT="0" distB="0" distL="0" distR="0">
+            <wp:extent cx="4476750" cy="2019300"/>
+            <wp:effectExtent t="0" r="0" b="0" l="0"/>
+            <wp:docPr id="7" name="cap3/10b-gof-documentos.png" descr="Sección «Documentos para contabilidad» en una Devolución aprobada." title="Sección «Documentos para contabilidad» en una Devolución aprobada."/>
+            <wp:cNvGraphicFramePr>
+              <a:graphicFrameLocks xmlns:a="http://schemas.openxmlformats.org/drawingml/2006/main" noChangeAspect="1"/>
+            </wp:cNvGraphicFramePr>
+            <a:graphic xmlns:a="http://schemas.openxmlformats.org/drawingml/2006/main">
+              <a:graphicData uri="http://schemas.openxmlformats.org/drawingml/2006/picture">
+                <pic:pic xmlns:pic="http://schemas.openxmlformats.org/drawingml/2006/picture">
+                  <pic:nvPicPr>
+                    <pic:cNvPr id="0" name="" descr=""/>
+                    <pic:cNvPicPr>
+                      <a:picLocks noChangeAspect="1" noChangeArrowheads="1"/>
+                    </pic:cNvPicPr>
+                  </pic:nvPicPr>
+                  <pic:blipFill>
+                    <a:blip r:embed="rId14" cstate="none"/>
+                    <a:srcRect/>
+                    <a:stretch>
+                      <a:fillRect/>
+                    </a:stretch>
+                  </pic:blipFill>
+                  <pic:spPr bwMode="auto">
+                    <a:xfrm>
+                      <a:off x="0" y="0"/>
+                      <a:ext cx="4476750" cy="2019300"/>
+                    </a:xfrm>
+                    <a:prstGeom prst="rect">
+                      <a:avLst/>
+                    </a:prstGeom>
+                  </pic:spPr>
+                </pic:pic>
+              </a:graphicData>
+            </a:graphic>
+          </wp:inline>
+        </w:drawing>
+      </w:r>
+    </w:p>
+    <w:p>
+      <w:pPr>
+        <w:spacing w:after="200"/>
+        <w:jc w:val="center"/>
+      </w:pPr>
+      <w:r>
+        <w:rPr>
+          <w:i/>
+          <w:iCs/>
+          <w:color w:val="666666"/>
+          <w:sz w:val="18"/>
+          <w:szCs w:val="18"/>
+        </w:rPr>
+        <w:t xml:space="preserve">Sección «Documentos para contabilidad» en una Devolución aprobada.</w:t>
+      </w:r>
+    </w:p>
+    <w:p>
+      <w:pPr>
+        <w:pStyle w:val="ListParagraph"/>
+        <w:numPr>
+          <w:ilvl w:val="0"/>
+          <w:numId w:val="6"/>
+        </w:numPr>
+        <w:spacing w:after="80"/>
+      </w:pPr>
+      <w:r>
+        <w:t xml:space="preserve">Revisa con </w:t>
+      </w:r>
+      <w:r>
+        <w:rPr>
+          <w:b/>
+          <w:bCs/>
+        </w:rPr>
+        <w:t xml:space="preserve">Ver</w:t>
+      </w:r>
+      <w:r>
+        <w:t xml:space="preserve"> que sea el archivo correcto. Si te equivocaste, bórralo antes de enviar.</w:t>
+      </w:r>
+    </w:p>
+    <w:p>
+      <w:pPr>
+        <w:pStyle w:val="ListParagraph"/>
+        <w:numPr>
+          <w:ilvl w:val="0"/>
+          <w:numId w:val="6"/>
+        </w:numPr>
+        <w:spacing w:after="80"/>
+      </w:pPr>
+      <w:r>
+        <w:t xml:space="preserve">Pulsa </w:t>
+      </w:r>
+      <w:r>
+        <w:rPr>
+          <w:b/>
+          <w:bCs/>
+        </w:rPr>
+        <w:t xml:space="preserve">Enviar a contabilidad</w:t>
+      </w:r>
+      <w:r>
+        <w:t xml:space="preserve">. El reporte pasa a </w:t>
+      </w:r>
+      <w:r>
+        <w:rPr>
+          <w:b/>
+          <w:bCs/>
+        </w:rPr>
+        <w:t xml:space="preserve">En contabilidad</w:t>
+      </w:r>
+      <w:r>
+        <w:t xml:space="preserve"> y le aparece a Contabilidad, que registra el pago del proveedor y lo cierra.</w:t>
+      </w:r>
+    </w:p>
+    <w:tbl>
+      <w:tblPr>
+        <w:tblW w:type="dxa" w:w="9360"/>
+        <w:tblBorders>
+          <w:top w:val="single" w:color="auto" w:sz="4"/>
+          <w:left w:val="single" w:color="auto" w:sz="4"/>
+          <w:bottom w:val="single" w:color="auto" w:sz="4"/>
+          <w:right w:val="single" w:color="auto" w:sz="4"/>
+          <w:insideH w:val="single" w:color="auto" w:sz="4"/>
+          <w:insideV w:val="single" w:color="auto" w:sz="4"/>
+        </w:tblBorders>
+      </w:tblPr>
+      <w:tblGrid>
+        <w:gridCol w:w="9360"/>
+      </w:tblGrid>
+      <w:tr>
+        <w:tc>
+          <w:tcPr>
+            <w:tcW w:type="dxa" w:w="9360"/>
+            <w:tcBorders>
+              <w:top w:val="none"/>
+              <w:left w:val="single" w:color="7A1F5C" w:sz="24"/>
+              <w:bottom w:val="none"/>
+              <w:right w:val="none"/>
+            </w:tcBorders>
+            <w:shd w:fill="FFF4DC" w:color="auto" w:val="clear"/>
+            <w:tcMar>
+              <w:top w:type="dxa" w:w="120"/>
+              <w:left w:type="dxa" w:w="180"/>
+              <w:bottom w:type="dxa" w:w="120"/>
+              <w:right w:type="dxa" w:w="180"/>
+            </w:tcMar>
+          </w:tcPr>
+          <w:p>
+            <w:r>
+              <w:rPr>
+                <w:b/>
+                <w:bCs/>
+              </w:rPr>
+              <w:t xml:space="preserve">Ojo: </w:t>
+            </w:r>
+            <w:r>
+              <w:t xml:space="preserve">el botón «Enviar a contabilidad» solo funciona con al menos un documento subido. Después de enviarlo, el documento ya no se puede borrar. Estos documentos no van al proveedor.</w:t>
+            </w:r>
+          </w:p>
+        </w:tc>
+      </w:tr>
+    </w:tbl>
+    <w:p>
+      <w:pPr>
+        <w:pStyle w:val="Heading1"/>
+        <w:spacing w:after="160" w:before="320"/>
+      </w:pPr>
+      <w:r>
+        <w:t xml:space="preserve">4. Si ves esto, haz esto</w:t>
       </w:r>
     </w:p>
     <w:tbl>
@@ -1380,6 +1889,74 @@
           </w:tcPr>
           <w:p>
             <w:r>
+              <w:t xml:space="preserve">«Sube al menos un documento (PDF o Excel)…»</w:t>
+            </w:r>
+          </w:p>
+        </w:tc>
+        <w:tc>
+          <w:tcPr>
+            <w:tcW w:type="dxa" w:w="5460"/>
+            <w:tcMar>
+              <w:top w:type="dxa" w:w="80"/>
+              <w:left w:type="dxa" w:w="120"/>
+              <w:bottom w:type="dxa" w:w="80"/>
+              <w:right w:type="dxa" w:w="120"/>
+            </w:tcMar>
+          </w:tcPr>
+          <w:p>
+            <w:r>
+              <w:t xml:space="preserve">En una Devolución aprobada, sube el documento antes de enviar a contabilidad.</w:t>
+            </w:r>
+          </w:p>
+        </w:tc>
+      </w:tr>
+      <w:tr>
+        <w:tc>
+          <w:tcPr>
+            <w:tcW w:type="dxa" w:w="3900"/>
+            <w:tcMar>
+              <w:top w:type="dxa" w:w="80"/>
+              <w:left w:type="dxa" w:w="120"/>
+              <w:bottom w:type="dxa" w:w="80"/>
+              <w:right w:type="dxa" w:w="120"/>
+            </w:tcMar>
+          </w:tcPr>
+          <w:p>
+            <w:r>
+              <w:t xml:space="preserve">«Solo se permiten archivos Excel (.xlsx/.xls) o PDF.»</w:t>
+            </w:r>
+          </w:p>
+        </w:tc>
+        <w:tc>
+          <w:tcPr>
+            <w:tcW w:type="dxa" w:w="5460"/>
+            <w:tcMar>
+              <w:top w:type="dxa" w:w="80"/>
+              <w:left w:type="dxa" w:w="120"/>
+              <w:bottom w:type="dxa" w:w="80"/>
+              <w:right w:type="dxa" w:w="120"/>
+            </w:tcMar>
+          </w:tcPr>
+          <w:p>
+            <w:r>
+              <w:t xml:space="preserve">Sube el documento en PDF o Excel.</w:t>
+            </w:r>
+          </w:p>
+        </w:tc>
+      </w:tr>
+      <w:tr>
+        <w:tc>
+          <w:tcPr>
+            <w:tcW w:type="dxa" w:w="3900"/>
+            <w:tcMar>
+              <w:top w:type="dxa" w:w="80"/>
+              <w:left w:type="dxa" w:w="120"/>
+              <w:bottom w:type="dxa" w:w="80"/>
+              <w:right w:type="dxa" w:w="120"/>
+            </w:tcMar>
+          </w:tcPr>
+          <w:p>
+            <w:r>
               <w:t xml:space="preserve">No encuentro un reporte que me dijeron</w:t>
             </w:r>
           </w:p>
@@ -1396,7 +1973,7 @@
           </w:tcPr>
           <w:p>
             <w:r>
-              <w:t xml:space="preserve">Solo ves los NF. Si no es NF (por ejemplo, Devolución aprobada), no te toca.</w:t>
+              <w:t xml:space="preserve">Solo ves NF y Devoluciones aprobadas. Si sigue Pendiente (con la compradora), todavía no te toca.</w:t>
             </w:r>
           </w:p>
         </w:tc>
@@ -1651,6 +2228,106 @@
           </w:tcPr>
           <w:p>
             <w:r>
+              <w:t xml:space="preserve">Devolución aprobada</w:t>
+            </w:r>
+          </w:p>
+        </w:tc>
+        <w:tc>
+          <w:tcPr>
+            <w:tcW w:type="dxa" w:w="4160"/>
+            <w:tcMar>
+              <w:top w:type="dxa" w:w="80"/>
+              <w:left w:type="dxa" w:w="120"/>
+              <w:bottom w:type="dxa" w:w="80"/>
+              <w:right w:type="dxa" w:w="120"/>
+            </w:tcMar>
+          </w:tcPr>
+          <w:p>
+            <w:r>
+              <w:t xml:space="preserve">El proveedor aprobó la devolución.</w:t>
+            </w:r>
+          </w:p>
+        </w:tc>
+        <w:tc>
+          <w:tcPr>
+            <w:tcW w:type="dxa" w:w="2500"/>
+            <w:tcMar>
+              <w:top w:type="dxa" w:w="80"/>
+              <w:left w:type="dxa" w:w="120"/>
+              <w:bottom w:type="dxa" w:w="80"/>
+              <w:right w:type="dxa" w:w="120"/>
+            </w:tcMar>
+          </w:tcPr>
+          <w:p>
+            <w:r>
+              <w:t xml:space="preserve">Gof (documento para contabilidad)</w:t>
+            </w:r>
+          </w:p>
+        </w:tc>
+      </w:tr>
+      <w:tr>
+        <w:tc>
+          <w:tcPr>
+            <w:tcW w:type="dxa" w:w="2700"/>
+            <w:tcMar>
+              <w:top w:type="dxa" w:w="80"/>
+              <w:left w:type="dxa" w:w="120"/>
+              <w:bottom w:type="dxa" w:w="80"/>
+              <w:right w:type="dxa" w:w="120"/>
+            </w:tcMar>
+          </w:tcPr>
+          <w:p>
+            <w:r>
+              <w:t xml:space="preserve">En contabilidad</w:t>
+            </w:r>
+          </w:p>
+        </w:tc>
+        <w:tc>
+          <w:tcPr>
+            <w:tcW w:type="dxa" w:w="4160"/>
+            <w:tcMar>
+              <w:top w:type="dxa" w:w="80"/>
+              <w:left w:type="dxa" w:w="120"/>
+              <w:bottom w:type="dxa" w:w="80"/>
+              <w:right w:type="dxa" w:w="120"/>
+            </w:tcMar>
+          </w:tcPr>
+          <w:p>
+            <w:r>
+              <w:t xml:space="preserve">Documento enviado; falta el pago del proveedor.</w:t>
+            </w:r>
+          </w:p>
+        </w:tc>
+        <w:tc>
+          <w:tcPr>
+            <w:tcW w:type="dxa" w:w="2500"/>
+            <w:tcMar>
+              <w:top w:type="dxa" w:w="80"/>
+              <w:left w:type="dxa" w:w="120"/>
+              <w:bottom w:type="dxa" w:w="80"/>
+              <w:right w:type="dxa" w:w="120"/>
+            </w:tcMar>
+          </w:tcPr>
+          <w:p>
+            <w:r>
+              <w:t xml:space="preserve">Contabilidad</w:t>
+            </w:r>
+          </w:p>
+        </w:tc>
+      </w:tr>
+      <w:tr>
+        <w:tc>
+          <w:tcPr>
+            <w:tcW w:type="dxa" w:w="2700"/>
+            <w:tcMar>
+              <w:top w:type="dxa" w:w="80"/>
+              <w:left w:type="dxa" w:w="120"/>
+              <w:bottom w:type="dxa" w:w="80"/>
+              <w:right w:type="dxa" w:w="120"/>
+            </w:tcMar>
+          </w:tcPr>
+          <w:p>
+            <w:r>
               <w:t xml:space="preserve">Cerrado</w:t>
             </w:r>
           </w:p>
@@ -1667,7 +2344,7 @@
           </w:tcPr>
           <w:p>
             <w:r>
-              <w:t xml:space="preserve">Validado y terminado.</w:t>
+              <w:t xml:space="preserve">Terminado: NF validado o pago recibido.</w:t>
             </w:r>
           </w:p>
         </w:tc>
@@ -1953,6 +2630,40 @@
       </w:rPr>
     </w:lvl>
   </w:abstractNum>
+  <w:abstractNum w:abstractNumId="5" w15:restartNumberingAfterBreak="0">
+    <w:multiLevelType w:val="hybridMultilevel"/>
+    <w:lvl w:ilvl="0" w:tentative="1">
+      <w:start w:val="1"/>
+      <w:numFmt w:val="decimal"/>
+      <w:lvlText w:val="%1."/>
+      <w:lvlJc w:val="left"/>
+      <w:pPr>
+        <w:ind w:left="540" w:hanging="360"/>
+      </w:pPr>
+      <w:rPr>
+        <w:b/>
+        <w:bCs/>
+        <w:color w:val="7A1F5C"/>
+      </w:rPr>
+    </w:lvl>
+  </w:abstractNum>
+  <w:abstractNum w:abstractNumId="6" w15:restartNumberingAfterBreak="0">
+    <w:multiLevelType w:val="hybridMultilevel"/>
+    <w:lvl w:ilvl="0" w:tentative="1">
+      <w:start w:val="3"/>
+      <w:numFmt w:val="decimal"/>
+      <w:lvlText w:val="%1."/>
+      <w:lvlJc w:val="left"/>
+      <w:pPr>
+        <w:ind w:left="540" w:hanging="360"/>
+      </w:pPr>
+      <w:rPr>
+        <w:b/>
+        <w:bCs/>
+        <w:color w:val="7A1F5C"/>
+      </w:rPr>
+    </w:lvl>
+  </w:abstractNum>
   <w:num w:numId="1">
     <w:abstractNumId w:val="1"/>
     <w:lvlOverride w:ilvl="0">
@@ -1975,6 +2686,18 @@
     <w:abstractNumId w:val="4"/>
     <w:lvlOverride w:ilvl="0">
       <w:startOverride w:val="5"/>
+    </w:lvlOverride>
+  </w:num>
+  <w:num w:numId="5">
+    <w:abstractNumId w:val="5"/>
+    <w:lvlOverride w:ilvl="0">
+      <w:startOverride w:val="1"/>
+    </w:lvlOverride>
+  </w:num>
+  <w:num w:numId="6">
+    <w:abstractNumId w:val="6"/>
+    <w:lvlOverride w:ilvl="0">
+      <w:startOverride w:val="3"/>
     </w:lvlOverride>
   </w:num>
 </w:numbering>

</xml_diff>